<commit_message>
Initial commit - TheMovieDB integration project
</commit_message>
<xml_diff>
--- a/docs/Project Instructions.docx
+++ b/docs/Project Instructions.docx
@@ -593,21 +593,7 @@
           <w:b/>
           <w:bCs/>
         </w:rPr>
-        <w:t>T</w:t>
-      </w:r>
-      <w:r>
-        <w:rPr>
-          <w:b/>
-          <w:bCs/>
-        </w:rPr>
-        <w:t>racker</w:t>
-      </w:r>
-      <w:r>
-        <w:rPr>
-          <w:b/>
-          <w:bCs/>
-        </w:rPr>
-        <w:t>s</w:t>
+        <w:t>Audit</w:t>
       </w:r>
       <w:r>
         <w:rPr>
@@ -659,36 +645,248 @@
           <w:ilvl w:val="2"/>
           <w:numId w:val="1"/>
         </w:numPr>
-      </w:pPr>
-      <w:r>
-        <w:rPr>
-          <w:b/>
-          <w:bCs/>
-        </w:rPr>
-        <w:t>last</w:t>
-      </w:r>
-      <w:r>
-        <w:rPr>
-          <w:b/>
-          <w:bCs/>
-        </w:rPr>
-        <w:t>_</w:t>
-      </w:r>
-      <w:r>
-        <w:rPr>
-          <w:b/>
-          <w:bCs/>
-        </w:rPr>
-        <w:t xml:space="preserve"> processed_ batch</w:t>
-      </w:r>
-      <w:r>
-        <w:t xml:space="preserve">: </w:t>
-      </w:r>
-      <w:r>
-        <w:t>sequential index</w:t>
-      </w:r>
-      <w:r>
-        <w:t>.</w:t>
+        <w:rPr>
+          <w:b/>
+          <w:bCs/>
+        </w:rPr>
+      </w:pPr>
+      <w:proofErr w:type="spellStart"/>
+      <w:r>
+        <w:rPr>
+          <w:b/>
+          <w:bCs/>
+        </w:rPr>
+        <w:t>last_processed_batch</w:t>
+      </w:r>
+      <w:proofErr w:type="spellEnd"/>
+      <w:r>
+        <w:rPr>
+          <w:b/>
+          <w:bCs/>
+        </w:rPr>
+        <w:t>:</w:t>
+      </w:r>
+      <w:r>
+        <w:rPr>
+          <w:b/>
+          <w:bCs/>
+        </w:rPr>
+        <w:t xml:space="preserve"> </w:t>
+      </w:r>
+      <w:r>
+        <w:t>Sequential index of the batch (e.g., 1000)</w:t>
+      </w:r>
+    </w:p>
+    <w:p>
+      <w:pPr>
+        <w:numPr>
+          <w:ilvl w:val="2"/>
+          <w:numId w:val="1"/>
+        </w:numPr>
+        <w:rPr>
+          <w:b/>
+          <w:bCs/>
+        </w:rPr>
+      </w:pPr>
+      <w:proofErr w:type="spellStart"/>
+      <w:r>
+        <w:rPr>
+          <w:b/>
+          <w:bCs/>
+        </w:rPr>
+        <w:t>raw_count</w:t>
+      </w:r>
+      <w:proofErr w:type="spellEnd"/>
+      <w:r>
+        <w:rPr>
+          <w:b/>
+          <w:bCs/>
+        </w:rPr>
+        <w:t>:</w:t>
+      </w:r>
+      <w:r>
+        <w:rPr>
+          <w:b/>
+          <w:bCs/>
+        </w:rPr>
+        <w:t xml:space="preserve"> </w:t>
+      </w:r>
+      <w:r>
+        <w:t>Total number of records received (e.g., 822)</w:t>
+      </w:r>
+    </w:p>
+    <w:p>
+      <w:pPr>
+        <w:numPr>
+          <w:ilvl w:val="2"/>
+          <w:numId w:val="1"/>
+        </w:numPr>
+      </w:pPr>
+      <w:proofErr w:type="spellStart"/>
+      <w:r>
+        <w:rPr>
+          <w:b/>
+          <w:bCs/>
+        </w:rPr>
+        <w:t>inserted_count</w:t>
+      </w:r>
+      <w:proofErr w:type="spellEnd"/>
+      <w:r>
+        <w:rPr>
+          <w:b/>
+          <w:bCs/>
+        </w:rPr>
+        <w:t>:</w:t>
+      </w:r>
+      <w:r>
+        <w:rPr>
+          <w:b/>
+          <w:bCs/>
+        </w:rPr>
+        <w:t xml:space="preserve"> </w:t>
+      </w:r>
+      <w:r>
+        <w:t>Number of records successfully inserted (e.g., 812)</w:t>
+      </w:r>
+    </w:p>
+    <w:p>
+      <w:pPr>
+        <w:numPr>
+          <w:ilvl w:val="2"/>
+          <w:numId w:val="1"/>
+        </w:numPr>
+      </w:pPr>
+      <w:proofErr w:type="spellStart"/>
+      <w:r>
+        <w:rPr>
+          <w:b/>
+          <w:bCs/>
+        </w:rPr>
+        <w:t>skipped_count</w:t>
+      </w:r>
+      <w:proofErr w:type="spellEnd"/>
+      <w:r>
+        <w:rPr>
+          <w:b/>
+          <w:bCs/>
+        </w:rPr>
+        <w:t>:</w:t>
+      </w:r>
+      <w:r>
+        <w:rPr>
+          <w:b/>
+          <w:bCs/>
+        </w:rPr>
+        <w:t xml:space="preserve"> </w:t>
+      </w:r>
+      <w:r>
+        <w:t>Number of records skipped during processing (e.g., 10)</w:t>
+      </w:r>
+    </w:p>
+    <w:p>
+      <w:pPr>
+        <w:numPr>
+          <w:ilvl w:val="2"/>
+          <w:numId w:val="1"/>
+        </w:numPr>
+        <w:rPr>
+          <w:b/>
+          <w:bCs/>
+        </w:rPr>
+      </w:pPr>
+      <w:proofErr w:type="spellStart"/>
+      <w:r>
+        <w:rPr>
+          <w:b/>
+          <w:bCs/>
+        </w:rPr>
+        <w:t>error_count</w:t>
+      </w:r>
+      <w:proofErr w:type="spellEnd"/>
+      <w:r>
+        <w:rPr>
+          <w:b/>
+          <w:bCs/>
+        </w:rPr>
+        <w:t>:</w:t>
+      </w:r>
+      <w:r>
+        <w:rPr>
+          <w:b/>
+          <w:bCs/>
+        </w:rPr>
+        <w:t xml:space="preserve"> </w:t>
+      </w:r>
+      <w:r>
+        <w:t>Number of records that caused errors (e.g., 0)</w:t>
+      </w:r>
+    </w:p>
+    <w:p>
+      <w:pPr>
+        <w:numPr>
+          <w:ilvl w:val="2"/>
+          <w:numId w:val="1"/>
+        </w:numPr>
+        <w:rPr>
+          <w:b/>
+          <w:bCs/>
+        </w:rPr>
+      </w:pPr>
+      <w:r>
+        <w:rPr>
+          <w:b/>
+          <w:bCs/>
+        </w:rPr>
+        <w:t>status</w:t>
+      </w:r>
+      <w:r>
+        <w:rPr>
+          <w:b/>
+          <w:bCs/>
+        </w:rPr>
+        <w:t>:</w:t>
+      </w:r>
+      <w:r>
+        <w:rPr>
+          <w:b/>
+          <w:bCs/>
+        </w:rPr>
+        <w:t xml:space="preserve"> </w:t>
+      </w:r>
+      <w:r>
+        <w:t>Processing status of the batch (e.g., "SUCCESS")</w:t>
+      </w:r>
+    </w:p>
+    <w:p>
+      <w:pPr>
+        <w:numPr>
+          <w:ilvl w:val="2"/>
+          <w:numId w:val="1"/>
+        </w:numPr>
+      </w:pPr>
+      <w:r>
+        <w:rPr>
+          <w:b/>
+          <w:bCs/>
+        </w:rPr>
+        <w:t>timestamp</w:t>
+      </w:r>
+      <w:r>
+        <w:rPr>
+          <w:b/>
+          <w:bCs/>
+        </w:rPr>
+        <w:t>:</w:t>
+      </w:r>
+      <w:r>
+        <w:rPr>
+          <w:b/>
+          <w:bCs/>
+        </w:rPr>
+        <w:t xml:space="preserve"> </w:t>
+      </w:r>
+      <w:r>
+        <w:t>Date and time of batch processing (e.g., 2025-08-29T07:42:26.421+00:00)</w:t>
       </w:r>
     </w:p>
     <w:p>
@@ -818,6 +1016,7 @@
           <w:b/>
           <w:bCs/>
         </w:rPr>
+        <w:lastRenderedPageBreak/>
         <w:t>Data Mapping</w:t>
       </w:r>
       <w:r>
@@ -901,7 +1100,6 @@
         </w:numPr>
       </w:pPr>
       <w:r>
-        <w:lastRenderedPageBreak/>
         <w:t>Deduplicate entries using unique identifiers.</w:t>
       </w:r>
     </w:p>
@@ -1287,6 +1485,52 @@
           <w:b/>
           <w:bCs/>
         </w:rPr>
+        <w:t>Containerization / Environment:</w:t>
+      </w:r>
+      <w:r>
+        <w:t xml:space="preserve"> Docker for running </w:t>
+      </w:r>
+      <w:r>
+        <w:t>MongoDB</w:t>
+      </w:r>
+      <w:r>
+        <w:t xml:space="preserve"> and other services in isolated environments.</w:t>
+      </w:r>
+    </w:p>
+    <w:p>
+      <w:pPr>
+        <w:numPr>
+          <w:ilvl w:val="0"/>
+          <w:numId w:val="3"/>
+        </w:numPr>
+      </w:pPr>
+      <w:r>
+        <w:rPr>
+          <w:b/>
+          <w:bCs/>
+        </w:rPr>
+        <w:lastRenderedPageBreak/>
+        <w:t>Database Management Tool:</w:t>
+      </w:r>
+      <w:r>
+        <w:t xml:space="preserve"> </w:t>
+      </w:r>
+      <w:r>
+        <w:t>MongoDB Compass – A visual interface for exploring, managing, and analyzing MongoDB databases.</w:t>
+      </w:r>
+    </w:p>
+    <w:p>
+      <w:pPr>
+        <w:numPr>
+          <w:ilvl w:val="0"/>
+          <w:numId w:val="3"/>
+        </w:numPr>
+      </w:pPr>
+      <w:r>
+        <w:rPr>
+          <w:b/>
+          <w:bCs/>
+        </w:rPr>
         <w:t>API</w:t>
       </w:r>
       <w:r>
@@ -1424,7 +1668,6 @@
           <w:b/>
           <w:bCs/>
         </w:rPr>
-        <w:lastRenderedPageBreak/>
         <w:t>Efficient Data Storage:</w:t>
       </w:r>
       <w:r>
@@ -2943,7 +3186,6 @@
   <w:style w:type="character" w:default="1" w:styleId="DefaultParagraphFont">
     <w:name w:val="Default Paragraph Font"/>
     <w:uiPriority w:val="1"/>
-    <w:semiHidden/>
     <w:unhideWhenUsed/>
   </w:style>
   <w:style w:type="table" w:default="1" w:styleId="TableNormal">
@@ -3298,6 +3540,17 @@
       <w:szCs w:val="24"/>
     </w:rPr>
   </w:style>
+  <w:style w:type="character" w:styleId="Strong">
+    <w:name w:val="Strong"/>
+    <w:basedOn w:val="DefaultParagraphFont"/>
+    <w:uiPriority w:val="22"/>
+    <w:qFormat/>
+    <w:rsid w:val="006509AF"/>
+    <w:rPr>
+      <w:b/>
+      <w:bCs/>
+    </w:rPr>
+  </w:style>
 </w:styles>
 </file>
 

</xml_diff>